<commit_message>
feat(contract): implement term editing for Hợp đồng Thi công and Hợp đồng Ca máy
</commit_message>
<xml_diff>
--- a/templatesHopDong/Template_HDCM.docx
+++ b/templatesHopDong/Template_HDCM.docx
@@ -2297,6 +2297,77 @@
     </w:p>
     <w:p>
       <w:pPr>
+        <w:pStyle w:val="oancuaDanhsach"/>
+        <w:spacing w:after="0" w:line="276" w:lineRule="auto"/>
+        <w:ind w:left="0" w:firstLine="360"/>
+        <w:jc w:val="both"/>
+        <w:rPr>
+          <w:sz w:val="26"/>
+          <w:szCs w:val="26"/>
+          <w:lang w:val="en-US"/>
+        </w:rPr>
+      </w:pPr>
+      <w:r>
+        <w:rPr>
+          <w:sz w:val="26"/>
+          <w:szCs w:val="26"/>
+          <w:lang w:val="en-US"/>
+        </w:rPr>
+        <w:t>[dieu4_content]</w:t>
+      </w:r>
+    </w:p>
+    <w:p>
+      <w:pPr>
+        <w:pStyle w:val="ListParagraph"/>
+        <w:numPr>
+          <w:ilvl w:val="0"/>
+          <w:numId w:val="8"/>
+        </w:numPr>
+        <w:spacing w:before="120" w:after="120" w:line="276" w:lineRule="auto"/>
+        <w:contextualSpacing w:val="0"/>
+        <w:jc w:val="both"/>
+        <w:rPr>
+          <w:b/>
+          <w:bCs/>
+          <w:sz w:val="26"/>
+          <w:szCs w:val="26"/>
+          <w:lang w:val="en-US"/>
+        </w:rPr>
+      </w:pPr>
+      <w:r>
+        <w:rPr>
+          <w:b/>
+          <w:bCs/>
+          <w:sz w:val="26"/>
+          <w:szCs w:val="26"/>
+          <w:lang w:val="en-US"/>
+        </w:rPr>
+        <w:t>Phương thức thanh toán:</w:t>
+      </w:r>
+    </w:p>
+    <w:p>
+      <w:pPr>
+        <w:pStyle w:val="oancuaDanhsach"/>
+        <w:spacing w:after="0" w:line="276" w:lineRule="auto"/>
+        <w:ind w:left="0" w:firstLine="360"/>
+        <w:jc w:val="both"/>
+        <w:rPr>
+          <w:sz w:val="26"/>
+          <w:szCs w:val="26"/>
+          <w:lang w:val="en-US"/>
+        </w:rPr>
+      </w:pPr>
+      <w:r>
+        <w:rPr>
+          <w:sz w:val="26"/>
+          <w:szCs w:val="26"/>
+          <w:lang w:val="en-US"/>
+        </w:rPr>
+        <w:t>[dieu5_content]</w:t>
+      </w:r>
+    </w:p>
+    <w:p>
+      <w:pPr>
         <w:pStyle w:val="ListParagraph"/>
         <w:numPr>
           <w:ilvl w:val="0"/>
@@ -2317,7 +2388,25 @@
           <w:szCs w:val="26"/>
           <w:lang w:val="en-US"/>
         </w:rPr>
-        <w:t>Căn cứ vào khối lượng thực tế thi công tại công trình, Bên A và Bên B đo đạc, lập Biên bản xác nhận ca máy để làm cơ sở thanh toán.</w:t>
+        <w:t xml:space="preserve">Căn cứ vào Biên bản xác nhận ca máy, Bên B xuất hóa đơn cho bên A và bên A sẽ thanh toán cho bên B 100% giá trị trong vòng </w:t>
+      </w:r>
+      <w:r>
+        <w:rPr>
+          <w:b/>
+          <w:bCs/>
+          <w:sz w:val="26"/>
+          <w:szCs w:val="26"/>
+          <w:lang w:val="en-US"/>
+        </w:rPr>
+        <w:t>240 ngày</w:t>
+      </w:r>
+      <w:r>
+        <w:rPr>
+          <w:sz w:val="26"/>
+          <w:szCs w:val="26"/>
+          <w:lang w:val="en-US"/>
+        </w:rPr>
+        <w:t xml:space="preserve"> kể từ ngày hai bên đối chiếu và xác nhận công nợ.</w:t>
       </w:r>
     </w:p>
     <w:p>
@@ -2346,104 +2435,6 @@
           <w:szCs w:val="26"/>
           <w:lang w:val="en-US"/>
         </w:rPr>
-        <w:t>Phương thức thanh toán:</w:t>
-      </w:r>
-    </w:p>
-    <w:p>
-      <w:pPr>
-        <w:pStyle w:val="ListParagraph"/>
-        <w:numPr>
-          <w:ilvl w:val="0"/>
-          <w:numId w:val="9"/>
-        </w:numPr>
-        <w:spacing w:after="0" w:line="276" w:lineRule="auto"/>
-        <w:ind w:left="0" w:firstLine="360"/>
-        <w:jc w:val="both"/>
-        <w:rPr>
-          <w:sz w:val="26"/>
-          <w:szCs w:val="26"/>
-          <w:lang w:val="en-US"/>
-        </w:rPr>
-      </w:pPr>
-      <w:r>
-        <w:rPr>
-          <w:sz w:val="26"/>
-          <w:szCs w:val="26"/>
-          <w:lang w:val="en-US"/>
-        </w:rPr>
-        <w:lastRenderedPageBreak/>
-        <w:t>Thanh toán bằng chuyển khoản.</w:t>
-      </w:r>
-    </w:p>
-    <w:p>
-      <w:pPr>
-        <w:pStyle w:val="ListParagraph"/>
-        <w:numPr>
-          <w:ilvl w:val="0"/>
-          <w:numId w:val="9"/>
-        </w:numPr>
-        <w:spacing w:after="0" w:line="276" w:lineRule="auto"/>
-        <w:ind w:left="0" w:firstLine="360"/>
-        <w:jc w:val="both"/>
-        <w:rPr>
-          <w:sz w:val="26"/>
-          <w:szCs w:val="26"/>
-          <w:lang w:val="en-US"/>
-        </w:rPr>
-      </w:pPr>
-      <w:r>
-        <w:rPr>
-          <w:sz w:val="26"/>
-          <w:szCs w:val="26"/>
-          <w:lang w:val="en-US"/>
-        </w:rPr>
-        <w:t xml:space="preserve">Căn cứ vào Biên bản xác nhận ca máy, Bên B xuất hóa đơn cho bên A và bên A sẽ thanh toán cho bên B 100% giá trị trong vòng </w:t>
-      </w:r>
-      <w:r>
-        <w:rPr>
-          <w:b/>
-          <w:bCs/>
-          <w:sz w:val="26"/>
-          <w:szCs w:val="26"/>
-          <w:lang w:val="en-US"/>
-        </w:rPr>
-        <w:t>240 ngày</w:t>
-      </w:r>
-      <w:r>
-        <w:rPr>
-          <w:sz w:val="26"/>
-          <w:szCs w:val="26"/>
-          <w:lang w:val="en-US"/>
-        </w:rPr>
-        <w:t xml:space="preserve"> kể từ ngày hai bên đối chiếu và xác nhận công nợ.</w:t>
-      </w:r>
-    </w:p>
-    <w:p>
-      <w:pPr>
-        <w:pStyle w:val="ListParagraph"/>
-        <w:numPr>
-          <w:ilvl w:val="0"/>
-          <w:numId w:val="8"/>
-        </w:numPr>
-        <w:spacing w:before="120" w:after="120" w:line="276" w:lineRule="auto"/>
-        <w:contextualSpacing w:val="0"/>
-        <w:jc w:val="both"/>
-        <w:rPr>
-          <w:b/>
-          <w:bCs/>
-          <w:sz w:val="26"/>
-          <w:szCs w:val="26"/>
-          <w:lang w:val="en-US"/>
-        </w:rPr>
-      </w:pPr>
-      <w:r>
-        <w:rPr>
-          <w:b/>
-          <w:bCs/>
-          <w:sz w:val="26"/>
-          <w:szCs w:val="26"/>
-          <w:lang w:val="en-US"/>
-        </w:rPr>
         <w:t>Trách nhiệm của các bên:</w:t>
       </w:r>
     </w:p>
@@ -2478,11 +2469,7 @@
     </w:p>
     <w:p>
       <w:pPr>
-        <w:pStyle w:val="ListParagraph"/>
-        <w:numPr>
-          <w:ilvl w:val="0"/>
-          <w:numId w:val="9"/>
-        </w:numPr>
+        <w:pStyle w:val="oancuaDanhsach"/>
         <w:spacing w:after="0" w:line="276" w:lineRule="auto"/>
         <w:ind w:left="0" w:firstLine="360"/>
         <w:jc w:val="both"/>
@@ -2498,132 +2485,7 @@
           <w:szCs w:val="26"/>
           <w:lang w:val="en-US"/>
         </w:rPr>
-        <w:t>Bố trí mặt bằng, địa hình tốt để máy hoạt động đảm bảo an toàn.</w:t>
-      </w:r>
-    </w:p>
-    <w:p>
-      <w:pPr>
-        <w:pStyle w:val="ListParagraph"/>
-        <w:numPr>
-          <w:ilvl w:val="0"/>
-          <w:numId w:val="9"/>
-        </w:numPr>
-        <w:spacing w:after="0" w:line="276" w:lineRule="auto"/>
-        <w:ind w:left="0" w:firstLine="360"/>
-        <w:jc w:val="both"/>
-        <w:rPr>
-          <w:sz w:val="26"/>
-          <w:szCs w:val="26"/>
-          <w:lang w:val="en-US"/>
-        </w:rPr>
-      </w:pPr>
-      <w:r>
-        <w:rPr>
-          <w:sz w:val="26"/>
-          <w:szCs w:val="26"/>
-          <w:lang w:val="en-US"/>
-        </w:rPr>
-        <w:t>Sắp xếp lịch làm việc hợp lý để đảm bảo sức khỏe thợ lái máy.</w:t>
-      </w:r>
-    </w:p>
-    <w:p>
-      <w:pPr>
-        <w:pStyle w:val="ListParagraph"/>
-        <w:numPr>
-          <w:ilvl w:val="0"/>
-          <w:numId w:val="9"/>
-        </w:numPr>
-        <w:spacing w:after="0" w:line="276" w:lineRule="auto"/>
-        <w:ind w:left="0" w:firstLine="360"/>
-        <w:jc w:val="both"/>
-        <w:rPr>
-          <w:sz w:val="26"/>
-          <w:szCs w:val="26"/>
-          <w:lang w:val="en-US"/>
-        </w:rPr>
-      </w:pPr>
-      <w:r>
-        <w:rPr>
-          <w:sz w:val="26"/>
-          <w:szCs w:val="26"/>
-          <w:lang w:val="en-US"/>
-        </w:rPr>
-        <w:t>Thanh toán tiền thuê máy đúng hạn và tuân thủ các điều khoản của hợp đồng.</w:t>
-      </w:r>
-    </w:p>
-    <w:p>
-      <w:pPr>
-        <w:pStyle w:val="ListParagraph"/>
-        <w:numPr>
-          <w:ilvl w:val="0"/>
-          <w:numId w:val="9"/>
-        </w:numPr>
-        <w:spacing w:after="0" w:line="276" w:lineRule="auto"/>
-        <w:ind w:left="0" w:firstLine="360"/>
-        <w:jc w:val="both"/>
-        <w:rPr>
-          <w:sz w:val="26"/>
-          <w:szCs w:val="26"/>
-          <w:lang w:val="en-US"/>
-        </w:rPr>
-      </w:pPr>
-      <w:r>
-        <w:rPr>
-          <w:sz w:val="26"/>
-          <w:szCs w:val="26"/>
-          <w:lang w:val="en-US"/>
-        </w:rPr>
-        <w:t>Xác lập lập Biên bản xác nhận ca máy thực tế để làm cơ sở thanh toán.</w:t>
-      </w:r>
-    </w:p>
-    <w:p>
-      <w:pPr>
-        <w:pStyle w:val="ListParagraph"/>
-        <w:numPr>
-          <w:ilvl w:val="0"/>
-          <w:numId w:val="9"/>
-        </w:numPr>
-        <w:spacing w:after="0" w:line="276" w:lineRule="auto"/>
-        <w:ind w:left="0" w:firstLine="360"/>
-        <w:jc w:val="both"/>
-        <w:rPr>
-          <w:sz w:val="26"/>
-          <w:szCs w:val="26"/>
-          <w:lang w:val="en-US"/>
-        </w:rPr>
-      </w:pPr>
-      <w:r>
-        <w:rPr>
-          <w:sz w:val="26"/>
-          <w:szCs w:val="26"/>
-          <w:lang w:val="en-US"/>
-        </w:rPr>
-        <w:t>Cam kết sử dụng máy đúng mục đích thuê.</w:t>
-      </w:r>
-    </w:p>
-    <w:p>
-      <w:pPr>
-        <w:pStyle w:val="ListParagraph"/>
-        <w:numPr>
-          <w:ilvl w:val="0"/>
-          <w:numId w:val="9"/>
-        </w:numPr>
-        <w:spacing w:after="0" w:line="276" w:lineRule="auto"/>
-        <w:ind w:left="0" w:firstLine="360"/>
-        <w:jc w:val="both"/>
-        <w:rPr>
-          <w:sz w:val="26"/>
-          <w:szCs w:val="26"/>
-          <w:lang w:val="en-US"/>
-        </w:rPr>
-      </w:pPr>
-      <w:r>
-        <w:rPr>
-          <w:sz w:val="26"/>
-          <w:szCs w:val="26"/>
-          <w:lang w:val="en-US"/>
-        </w:rPr>
-        <w:t>Thanh toán kinh phí cho bên B như Điều 5.</w:t>
+        <w:t>[dieu6_a_content]</w:t>
       </w:r>
     </w:p>
     <w:p>
@@ -2657,11 +2519,7 @@
     </w:p>
     <w:p>
       <w:pPr>
-        <w:pStyle w:val="ListParagraph"/>
-        <w:numPr>
-          <w:ilvl w:val="0"/>
-          <w:numId w:val="9"/>
-        </w:numPr>
+        <w:pStyle w:val="oancuaDanhsach"/>
         <w:spacing w:after="0" w:line="276" w:lineRule="auto"/>
         <w:ind w:left="0" w:firstLine="360"/>
         <w:jc w:val="both"/>
@@ -2677,157 +2535,7 @@
           <w:szCs w:val="26"/>
           <w:lang w:val="en-US"/>
         </w:rPr>
-        <w:t>Thiết bị đưa tới công trường phải trong điều kiện hoạt động bình thường tại mọi chế độ.</w:t>
-      </w:r>
-    </w:p>
-    <w:p>
-      <w:pPr>
-        <w:pStyle w:val="ListParagraph"/>
-        <w:numPr>
-          <w:ilvl w:val="0"/>
-          <w:numId w:val="9"/>
-        </w:numPr>
-        <w:spacing w:after="0" w:line="276" w:lineRule="auto"/>
-        <w:ind w:left="0" w:firstLine="360"/>
-        <w:jc w:val="both"/>
-        <w:rPr>
-          <w:sz w:val="26"/>
-          <w:szCs w:val="26"/>
-          <w:lang w:val="en-US"/>
-        </w:rPr>
-      </w:pPr>
-      <w:r>
-        <w:rPr>
-          <w:sz w:val="26"/>
-          <w:szCs w:val="26"/>
-          <w:lang w:val="en-US"/>
-        </w:rPr>
-        <w:t>Thợ vận hành máy phải luôn có mặt tại công trường trong giờ làm việc.</w:t>
-      </w:r>
-    </w:p>
-    <w:p>
-      <w:pPr>
-        <w:pStyle w:val="ListParagraph"/>
-        <w:numPr>
-          <w:ilvl w:val="0"/>
-          <w:numId w:val="9"/>
-        </w:numPr>
-        <w:spacing w:after="0" w:line="276" w:lineRule="auto"/>
-        <w:ind w:left="0" w:firstLine="360"/>
-        <w:jc w:val="both"/>
-        <w:rPr>
-          <w:sz w:val="26"/>
-          <w:szCs w:val="26"/>
-          <w:lang w:val="en-US"/>
-        </w:rPr>
-      </w:pPr>
-      <w:r>
-        <w:rPr>
-          <w:sz w:val="26"/>
-          <w:szCs w:val="26"/>
-          <w:lang w:val="en-US"/>
-        </w:rPr>
-        <w:t>Đảm bảo máy luôn vận hành tốt. Nếu do lỗi thiết bị, máy phải ngừng hoạt động trên 30 phút thì bên A có trách nhiệm làm bù giờ cho những giờ máy ngừng hoạt động.</w:t>
-      </w:r>
-    </w:p>
-    <w:p>
-      <w:pPr>
-        <w:pStyle w:val="ListParagraph"/>
-        <w:numPr>
-          <w:ilvl w:val="0"/>
-          <w:numId w:val="9"/>
-        </w:numPr>
-        <w:spacing w:after="0" w:line="276" w:lineRule="auto"/>
-        <w:ind w:left="0" w:firstLine="360"/>
-        <w:jc w:val="both"/>
-        <w:rPr>
-          <w:sz w:val="26"/>
-          <w:szCs w:val="26"/>
-          <w:lang w:val="en-US"/>
-        </w:rPr>
-      </w:pPr>
-      <w:r>
-        <w:rPr>
-          <w:sz w:val="26"/>
-          <w:szCs w:val="26"/>
-          <w:lang w:val="en-US"/>
-        </w:rPr>
-        <w:t>Đảm bảo tính hợp pháp của thiết bị khi các cơ quan có trách nhiệm kiểm tra.</w:t>
-      </w:r>
-    </w:p>
-    <w:p>
-      <w:pPr>
-        <w:pStyle w:val="ListParagraph"/>
-        <w:numPr>
-          <w:ilvl w:val="0"/>
-          <w:numId w:val="9"/>
-        </w:numPr>
-        <w:spacing w:after="0" w:line="276" w:lineRule="auto"/>
-        <w:ind w:left="0" w:firstLine="360"/>
-        <w:jc w:val="both"/>
-        <w:rPr>
-          <w:sz w:val="26"/>
-          <w:szCs w:val="26"/>
-          <w:lang w:val="en-US"/>
-        </w:rPr>
-      </w:pPr>
-      <w:r>
-        <w:rPr>
-          <w:sz w:val="26"/>
-          <w:szCs w:val="26"/>
-          <w:lang w:val="en-US"/>
-        </w:rPr>
-        <w:t>Tuyệt đối tuân thủ và tự chịu trách nhiệm về an toàn lao động trong quá trình vận hành máy tại công trường.</w:t>
-      </w:r>
-    </w:p>
-    <w:p>
-      <w:pPr>
-        <w:pStyle w:val="ListParagraph"/>
-        <w:numPr>
-          <w:ilvl w:val="0"/>
-          <w:numId w:val="9"/>
-        </w:numPr>
-        <w:spacing w:after="0" w:line="276" w:lineRule="auto"/>
-        <w:ind w:left="0" w:firstLine="360"/>
-        <w:jc w:val="both"/>
-        <w:rPr>
-          <w:sz w:val="26"/>
-          <w:szCs w:val="26"/>
-          <w:lang w:val="en-US"/>
-        </w:rPr>
-      </w:pPr>
-      <w:r>
-        <w:rPr>
-          <w:sz w:val="26"/>
-          <w:szCs w:val="26"/>
-          <w:lang w:val="en-US"/>
-        </w:rPr>
-        <w:t>Cùng bên B lập Biên bản xác nhận ca máy thực tế để làm cơ sở thanh toán và thanh lý hợp đồng.</w:t>
-      </w:r>
-    </w:p>
-    <w:p>
-      <w:pPr>
-        <w:pStyle w:val="ListParagraph"/>
-        <w:numPr>
-          <w:ilvl w:val="0"/>
-          <w:numId w:val="9"/>
-        </w:numPr>
-        <w:spacing w:after="0" w:line="276" w:lineRule="auto"/>
-        <w:ind w:left="0" w:firstLine="360"/>
-        <w:jc w:val="both"/>
-        <w:rPr>
-          <w:sz w:val="26"/>
-          <w:szCs w:val="26"/>
-          <w:lang w:val="en-US"/>
-        </w:rPr>
-      </w:pPr>
-      <w:r>
-        <w:rPr>
-          <w:sz w:val="26"/>
-          <w:szCs w:val="26"/>
-          <w:lang w:val="en-US"/>
-        </w:rPr>
-        <w:t>Xuất hóa đơn thuế GTGT cho bên A .</w:t>
+        <w:t>[dieu6_b_content]</w:t>
       </w:r>
     </w:p>
     <w:p>

</xml_diff>